<commit_message>
Setup firebase in team
- Register Student (Android, iOS, Web) and Admin (Android, Web) apps via FlutterFire CLI
- Add firebase_options.dart, google-services.json, GoogleService-Info.plist
- Student: switch cloud_firestore to firebase_database ^12.3.0 (Realtime Database)
- Admin: add firebase_core ^4.7.0; minSdk 23, compileSdk 35, AGP 8.6.1, Gradle 8.7
- Update worksheet for Realtime Database
</commit_message>
<xml_diff>
--- a/PennyPal_Timeline_WorksSheet.docx
+++ b/PennyPal_Timeline_WorksSheet.docx
@@ -2610,7 +2610,7 @@
                 <w:sz w:val="20"/>
                 <w:szCs w:val="20"/>
               </w:rPr>
-              <w:t>firestore.rules · firestore.indexes.json · database/schema.sql (gốc repo)</w:t>
+              <w:t>database.rules.json (rules + .indexOn) · database/schema.sql (gốc repo)</w:t>
             </w:r>
           </w:p>
         </w:tc>
@@ -8886,7 +8886,7 @@
         <w:spacing w:after="120"/>
       </w:pPr>
       <w:r>
-        <w:t xml:space="preserve">Hai app dùng chung Firestore. Tên field lấy đúng theo database.md. </w:t>
+        <w:t xml:space="preserve">Hai app dùng chung Firebase Realtime Database. Tên node / field lấy đúng theo database.md. </w:t>
       </w:r>
       <w:r>
         <w:rPr>
@@ -9691,7 +9691,7 @@
                 <w:sz w:val="20"/>
                 <w:szCs w:val="20"/>
               </w:rPr>
-              <w:t>A1 Overview + User Detail, A2 Analytics — chỉ aggregate query</w:t>
+              <w:t>A1 Overview + User Detail, A2 Analytics — đọc 1 lần rồi đếm / cộng ở app (RTDB không có aggregate)</w:t>
             </w:r>
           </w:p>
         </w:tc>
@@ -9793,7 +9793,7 @@
         <w:t>model Transaction</w:t>
       </w:r>
       <w:r>
-        <w:t xml:space="preserve"> của S1, ghi chung WriteBatch (D-05).</w:t>
+        <w:t xml:space="preserve"> của S1, ghi chung 1 multi-path update() (D-05).</w:t>
       </w:r>
     </w:p>
     <w:p>

</xml_diff>

<commit_message>
Update task sheet: M1 foundation completed
</commit_message>
<xml_diff>
--- a/PennyPal_Timeline_WorksSheet.docx
+++ b/PennyPal_Timeline_WorksSheet.docx
@@ -79,12 +79,6 @@
         <w:gridCol w:w="7497"/>
       </w:tblGrid>
       <w:tr>
-        <w:tblPrEx>
-          <w:tblCellMar>
-            <w:top w:w="0" w:type="dxa"/>
-            <w:bottom w:w="0" w:type="dxa"/>
-          </w:tblCellMar>
-        </w:tblPrEx>
         <w:trPr>
           <w:tblHeader/>
         </w:trPr>
@@ -150,12 +144,6 @@
         </w:tc>
       </w:tr>
       <w:tr>
-        <w:tblPrEx>
-          <w:tblCellMar>
-            <w:top w:w="0" w:type="dxa"/>
-            <w:bottom w:w="0" w:type="dxa"/>
-          </w:tblCellMar>
-        </w:tblPrEx>
         <w:tc>
           <w:tcPr>
             <w:tcW w:w="2141" w:type="dxa"/>
@@ -210,12 +198,6 @@
         </w:tc>
       </w:tr>
       <w:tr>
-        <w:tblPrEx>
-          <w:tblCellMar>
-            <w:top w:w="0" w:type="dxa"/>
-            <w:bottom w:w="0" w:type="dxa"/>
-          </w:tblCellMar>
-        </w:tblPrEx>
         <w:tc>
           <w:tcPr>
             <w:tcW w:w="2141" w:type="dxa"/>
@@ -270,12 +252,6 @@
         </w:tc>
       </w:tr>
       <w:tr>
-        <w:tblPrEx>
-          <w:tblCellMar>
-            <w:top w:w="0" w:type="dxa"/>
-            <w:bottom w:w="0" w:type="dxa"/>
-          </w:tblCellMar>
-        </w:tblPrEx>
         <w:tc>
           <w:tcPr>
             <w:tcW w:w="2141" w:type="dxa"/>
@@ -394,12 +370,6 @@
         </w:tc>
       </w:tr>
       <w:tr>
-        <w:tblPrEx>
-          <w:tblCellMar>
-            <w:top w:w="0" w:type="dxa"/>
-            <w:bottom w:w="0" w:type="dxa"/>
-          </w:tblCellMar>
-        </w:tblPrEx>
         <w:tc>
           <w:tcPr>
             <w:tcW w:w="2141" w:type="dxa"/>
@@ -492,12 +462,6 @@
         <w:gridCol w:w="2411"/>
       </w:tblGrid>
       <w:tr>
-        <w:tblPrEx>
-          <w:tblCellMar>
-            <w:top w:w="0" w:type="dxa"/>
-            <w:bottom w:w="0" w:type="dxa"/>
-          </w:tblCellMar>
-        </w:tblPrEx>
         <w:trPr>
           <w:tblHeader/>
         </w:trPr>
@@ -623,12 +587,6 @@
         </w:tc>
       </w:tr>
       <w:tr>
-        <w:tblPrEx>
-          <w:tblCellMar>
-            <w:top w:w="0" w:type="dxa"/>
-            <w:bottom w:w="0" w:type="dxa"/>
-          </w:tblCellMar>
-        </w:tblPrEx>
         <w:tc>
           <w:tcPr>
             <w:tcW w:w="963" w:type="dxa"/>
@@ -756,12 +714,6 @@
         </w:tc>
       </w:tr>
       <w:tr>
-        <w:tblPrEx>
-          <w:tblCellMar>
-            <w:top w:w="0" w:type="dxa"/>
-            <w:bottom w:w="0" w:type="dxa"/>
-          </w:tblCellMar>
-        </w:tblPrEx>
         <w:tc>
           <w:tcPr>
             <w:tcW w:w="963" w:type="dxa"/>
@@ -876,12 +828,6 @@
         </w:tc>
       </w:tr>
       <w:tr>
-        <w:tblPrEx>
-          <w:tblCellMar>
-            <w:top w:w="0" w:type="dxa"/>
-            <w:bottom w:w="0" w:type="dxa"/>
-          </w:tblCellMar>
-        </w:tblPrEx>
         <w:tc>
           <w:tcPr>
             <w:tcW w:w="963" w:type="dxa"/>
@@ -996,12 +942,6 @@
         </w:tc>
       </w:tr>
       <w:tr>
-        <w:tblPrEx>
-          <w:tblCellMar>
-            <w:top w:w="0" w:type="dxa"/>
-            <w:bottom w:w="0" w:type="dxa"/>
-          </w:tblCellMar>
-        </w:tblPrEx>
         <w:tc>
           <w:tcPr>
             <w:tcW w:w="963" w:type="dxa"/>
@@ -1116,12 +1056,6 @@
         </w:tc>
       </w:tr>
       <w:tr>
-        <w:tblPrEx>
-          <w:tblCellMar>
-            <w:top w:w="0" w:type="dxa"/>
-            <w:bottom w:w="0" w:type="dxa"/>
-          </w:tblCellMar>
-        </w:tblPrEx>
         <w:tc>
           <w:tcPr>
             <w:tcW w:w="963" w:type="dxa"/>
@@ -1276,12 +1210,6 @@
         <w:gridCol w:w="3856"/>
       </w:tblGrid>
       <w:tr>
-        <w:tblPrEx>
-          <w:tblCellMar>
-            <w:top w:w="0" w:type="dxa"/>
-            <w:bottom w:w="0" w:type="dxa"/>
-          </w:tblCellMar>
-        </w:tblPrEx>
         <w:trPr>
           <w:tblHeader/>
         </w:trPr>
@@ -1377,12 +1305,6 @@
         </w:tc>
       </w:tr>
       <w:tr>
-        <w:tblPrEx>
-          <w:tblCellMar>
-            <w:top w:w="0" w:type="dxa"/>
-            <w:bottom w:w="0" w:type="dxa"/>
-          </w:tblCellMar>
-        </w:tblPrEx>
         <w:tc>
           <w:tcPr>
             <w:tcW w:w="963" w:type="dxa"/>
@@ -1486,12 +1408,6 @@
         </w:tc>
       </w:tr>
       <w:tr>
-        <w:tblPrEx>
-          <w:tblCellMar>
-            <w:top w:w="0" w:type="dxa"/>
-            <w:bottom w:w="0" w:type="dxa"/>
-          </w:tblCellMar>
-        </w:tblPrEx>
         <w:tc>
           <w:tcPr>
             <w:tcW w:w="963" w:type="dxa"/>
@@ -1595,12 +1511,6 @@
         </w:tc>
       </w:tr>
       <w:tr>
-        <w:tblPrEx>
-          <w:tblCellMar>
-            <w:top w:w="0" w:type="dxa"/>
-            <w:bottom w:w="0" w:type="dxa"/>
-          </w:tblCellMar>
-        </w:tblPrEx>
         <w:tc>
           <w:tcPr>
             <w:tcW w:w="963" w:type="dxa"/>
@@ -1695,12 +1605,6 @@
         </w:tc>
       </w:tr>
       <w:tr>
-        <w:tblPrEx>
-          <w:tblCellMar>
-            <w:top w:w="0" w:type="dxa"/>
-            <w:bottom w:w="0" w:type="dxa"/>
-          </w:tblCellMar>
-        </w:tblPrEx>
         <w:tc>
           <w:tcPr>
             <w:tcW w:w="963" w:type="dxa"/>
@@ -1795,12 +1699,6 @@
         </w:tc>
       </w:tr>
       <w:tr>
-        <w:tblPrEx>
-          <w:tblCellMar>
-            <w:top w:w="0" w:type="dxa"/>
-            <w:bottom w:w="0" w:type="dxa"/>
-          </w:tblCellMar>
-        </w:tblPrEx>
         <w:tc>
           <w:tcPr>
             <w:tcW w:w="963" w:type="dxa"/>
@@ -1951,12 +1849,6 @@
         <w:gridCol w:w="8675"/>
       </w:tblGrid>
       <w:tr>
-        <w:tblPrEx>
-          <w:tblCellMar>
-            <w:top w:w="0" w:type="dxa"/>
-            <w:bottom w:w="0" w:type="dxa"/>
-          </w:tblCellMar>
-        </w:tblPrEx>
         <w:trPr>
           <w:tblHeader/>
         </w:trPr>
@@ -2022,12 +1914,6 @@
         </w:tc>
       </w:tr>
       <w:tr>
-        <w:tblPrEx>
-          <w:tblCellMar>
-            <w:top w:w="0" w:type="dxa"/>
-            <w:bottom w:w="0" w:type="dxa"/>
-          </w:tblCellMar>
-        </w:tblPrEx>
         <w:tc>
           <w:tcPr>
             <w:tcW w:w="963" w:type="dxa"/>
@@ -2122,12 +2008,6 @@
         </w:tc>
       </w:tr>
       <w:tr>
-        <w:tblPrEx>
-          <w:tblCellMar>
-            <w:top w:w="0" w:type="dxa"/>
-            <w:bottom w:w="0" w:type="dxa"/>
-          </w:tblCellMar>
-        </w:tblPrEx>
         <w:tc>
           <w:tcPr>
             <w:tcW w:w="963" w:type="dxa"/>
@@ -2204,12 +2084,6 @@
         </w:tc>
       </w:tr>
       <w:tr>
-        <w:tblPrEx>
-          <w:tblCellMar>
-            <w:top w:w="0" w:type="dxa"/>
-            <w:bottom w:w="0" w:type="dxa"/>
-          </w:tblCellMar>
-        </w:tblPrEx>
         <w:tc>
           <w:tcPr>
             <w:tcW w:w="963" w:type="dxa"/>
@@ -2317,12 +2191,6 @@
         <w:gridCol w:w="8675"/>
       </w:tblGrid>
       <w:tr>
-        <w:tblPrEx>
-          <w:tblCellMar>
-            <w:top w:w="0" w:type="dxa"/>
-            <w:bottom w:w="0" w:type="dxa"/>
-          </w:tblCellMar>
-        </w:tblPrEx>
         <w:trPr>
           <w:tblHeader/>
         </w:trPr>
@@ -2388,12 +2256,6 @@
         </w:tc>
       </w:tr>
       <w:tr>
-        <w:tblPrEx>
-          <w:tblCellMar>
-            <w:top w:w="0" w:type="dxa"/>
-            <w:bottom w:w="0" w:type="dxa"/>
-          </w:tblCellMar>
-        </w:tblPrEx>
         <w:tc>
           <w:tcPr>
             <w:tcW w:w="963" w:type="dxa"/>
@@ -2479,12 +2341,6 @@
         </w:tc>
       </w:tr>
       <w:tr>
-        <w:tblPrEx>
-          <w:tblCellMar>
-            <w:top w:w="0" w:type="dxa"/>
-            <w:bottom w:w="0" w:type="dxa"/>
-          </w:tblCellMar>
-        </w:tblPrEx>
         <w:tc>
           <w:tcPr>
             <w:tcW w:w="963" w:type="dxa"/>
@@ -2552,12 +2408,6 @@
         </w:tc>
       </w:tr>
       <w:tr>
-        <w:tblPrEx>
-          <w:tblCellMar>
-            <w:top w:w="0" w:type="dxa"/>
-            <w:bottom w:w="0" w:type="dxa"/>
-          </w:tblCellMar>
-        </w:tblPrEx>
         <w:tc>
           <w:tcPr>
             <w:tcW w:w="963" w:type="dxa"/>
@@ -2610,7 +2460,7 @@
                 <w:sz w:val="20"/>
                 <w:szCs w:val="20"/>
               </w:rPr>
-              <w:t>database.rules.json (rules + .indexOn) · database/schema.sql (gốc repo)</w:t>
+              <w:t>firestore.rules · firestore.indexes.json · database/schema.sql (gốc repo)</w:t>
             </w:r>
           </w:p>
         </w:tc>
@@ -2761,12 +2611,6 @@
         <w:gridCol w:w="1622"/>
       </w:tblGrid>
       <w:tr>
-        <w:tblPrEx>
-          <w:tblCellMar>
-            <w:top w:w="0" w:type="dxa"/>
-            <w:bottom w:w="0" w:type="dxa"/>
-          </w:tblCellMar>
-        </w:tblPrEx>
         <w:trPr>
           <w:tblHeader/>
         </w:trPr>
@@ -2996,12 +2840,6 @@
         </w:tc>
       </w:tr>
       <w:tr>
-        <w:tblPrEx>
-          <w:tblCellMar>
-            <w:top w:w="0" w:type="dxa"/>
-            <w:bottom w:w="0" w:type="dxa"/>
-          </w:tblCellMar>
-        </w:tblPrEx>
         <w:trPr>
           <w:cantSplit/>
         </w:trPr>
@@ -3099,72 +2937,93 @@
               <w:right w:w="100" w:type="dxa"/>
             </w:tcMar>
           </w:tcPr>
+          <w:p>
+            <w:pPr>
+              <w:rPr>
+                <w:lang w:val="vi-VN"/>
+              </w:rPr>
+            </w:pPr>
+            <w:r>
+              <w:rPr>
+                <w:sz w:val="18"/>
+                <w:szCs w:val="18"/>
+              </w:rPr>
+              <w:t xml:space="preserve">08:49</w:t>
+            </w:r>
+          </w:p>
+        </w:tc>
+        <w:tc>
+          <w:tcPr>
+            <w:tcW w:w="852" w:type="dxa"/>
+            <w:tcBorders>
+              <w:top w:val="single" w:sz="6" w:space="0" w:color="000000"/>
+              <w:left w:val="single" w:sz="6" w:space="0" w:color="000000"/>
+              <w:bottom w:val="single" w:sz="6" w:space="0" w:color="000000"/>
+              <w:right w:val="single" w:sz="6" w:space="0" w:color="000000"/>
+            </w:tcBorders>
+            <w:tcMar>
+              <w:top w:w="80" w:type="dxa"/>
+              <w:left w:w="100" w:type="dxa"/>
+              <w:bottom w:w="80" w:type="dxa"/>
+              <w:right w:w="100" w:type="dxa"/>
+            </w:tcMar>
+          </w:tcPr>
+          <w:p>
+            <w:r>
+              <w:rPr>
+                <w:sz w:val="18"/>
+                <w:szCs w:val="18"/>
+              </w:rPr>
+              <w:t xml:space="preserve">15:51</w:t>
+            </w:r>
+          </w:p>
+        </w:tc>
+        <w:tc>
+          <w:tcPr>
+            <w:tcW w:w="980" w:type="dxa"/>
+            <w:tcBorders>
+              <w:top w:val="single" w:sz="6" w:space="0" w:color="000000"/>
+              <w:left w:val="single" w:sz="6" w:space="0" w:color="000000"/>
+              <w:bottom w:val="single" w:sz="6" w:space="0" w:color="000000"/>
+              <w:right w:val="single" w:sz="6" w:space="0" w:color="000000"/>
+            </w:tcBorders>
+            <w:tcMar>
+              <w:top w:w="80" w:type="dxa"/>
+              <w:left w:w="100" w:type="dxa"/>
+              <w:bottom w:w="80" w:type="dxa"/>
+              <w:right w:w="100" w:type="dxa"/>
+            </w:tcMar>
+          </w:tcPr>
+          <w:p>
+            <w:r>
+              <w:rPr>
+                <w:sz w:val="18"/>
+                <w:szCs w:val="18"/>
+              </w:rPr>
+              <w:t>Completed</w:t>
+            </w:r>
+          </w:p>
+        </w:tc>
+        <w:tc>
+          <w:tcPr>
+            <w:tcW w:w="980" w:type="dxa"/>
+            <w:tcBorders>
+              <w:top w:val="single" w:sz="6" w:space="0" w:color="000000"/>
+              <w:left w:val="single" w:sz="6" w:space="0" w:color="000000"/>
+              <w:bottom w:val="single" w:sz="6" w:space="0" w:color="000000"/>
+              <w:right w:val="single" w:sz="6" w:space="0" w:color="000000"/>
+            </w:tcBorders>
+            <w:tcMar>
+              <w:top w:w="80" w:type="dxa"/>
+              <w:left w:w="100" w:type="dxa"/>
+              <w:bottom w:w="80" w:type="dxa"/>
+              <w:right w:w="100" w:type="dxa"/>
+            </w:tcMar>
+          </w:tcPr>
           <w:p/>
         </w:tc>
         <w:tc>
           <w:tcPr>
-            <w:tcW w:w="852" w:type="dxa"/>
-            <w:tcBorders>
-              <w:top w:val="single" w:sz="6" w:space="0" w:color="000000"/>
-              <w:left w:val="single" w:sz="6" w:space="0" w:color="000000"/>
-              <w:bottom w:val="single" w:sz="6" w:space="0" w:color="000000"/>
-              <w:right w:val="single" w:sz="6" w:space="0" w:color="000000"/>
-            </w:tcBorders>
-            <w:tcMar>
-              <w:top w:w="80" w:type="dxa"/>
-              <w:left w:w="100" w:type="dxa"/>
-              <w:bottom w:w="80" w:type="dxa"/>
-              <w:right w:w="100" w:type="dxa"/>
-            </w:tcMar>
-          </w:tcPr>
-          <w:p/>
-        </w:tc>
-        <w:tc>
-          <w:tcPr>
-            <w:tcW w:w="980" w:type="dxa"/>
-            <w:tcBorders>
-              <w:top w:val="single" w:sz="6" w:space="0" w:color="000000"/>
-              <w:left w:val="single" w:sz="6" w:space="0" w:color="000000"/>
-              <w:bottom w:val="single" w:sz="6" w:space="0" w:color="000000"/>
-              <w:right w:val="single" w:sz="6" w:space="0" w:color="000000"/>
-            </w:tcBorders>
-            <w:tcMar>
-              <w:top w:w="80" w:type="dxa"/>
-              <w:left w:w="100" w:type="dxa"/>
-              <w:bottom w:w="80" w:type="dxa"/>
-              <w:right w:w="100" w:type="dxa"/>
-            </w:tcMar>
-          </w:tcPr>
-          <w:p>
-            <w:r>
-              <w:rPr>
-                <w:sz w:val="18"/>
-                <w:szCs w:val="18"/>
-              </w:rPr>
-              <w:t>Pending</w:t>
-            </w:r>
-          </w:p>
-        </w:tc>
-        <w:tc>
-          <w:tcPr>
-            <w:tcW w:w="980" w:type="dxa"/>
-            <w:tcBorders>
-              <w:top w:val="single" w:sz="6" w:space="0" w:color="000000"/>
-              <w:left w:val="single" w:sz="6" w:space="0" w:color="000000"/>
-              <w:bottom w:val="single" w:sz="6" w:space="0" w:color="000000"/>
-              <w:right w:val="single" w:sz="6" w:space="0" w:color="000000"/>
-            </w:tcBorders>
-            <w:tcMar>
-              <w:top w:w="80" w:type="dxa"/>
-              <w:left w:w="100" w:type="dxa"/>
-              <w:bottom w:w="80" w:type="dxa"/>
-              <w:right w:w="100" w:type="dxa"/>
-            </w:tcMar>
-          </w:tcPr>
-          <w:p/>
-        </w:tc>
-        <w:tc>
-          <w:tcPr>
             <w:tcW w:w="1626" w:type="dxa"/>
             <w:tcBorders>
               <w:top w:val="single" w:sz="6" w:space="0" w:color="000000"/>
@@ -3180,23 +3039,30 @@
             </w:tcMar>
           </w:tcPr>
           <w:p>
-            <w:r>
-              <w:rPr>
-                <w:sz w:val="18"/>
-                <w:szCs w:val="18"/>
-              </w:rPr>
-              <w:t>S1</w:t>
+            <w:pPr>
+              <w:rPr>
+                <w:lang w:val="vi-VN"/>
+              </w:rPr>
+            </w:pPr>
+            <w:r>
+              <w:rPr>
+                <w:sz w:val="18"/>
+                <w:szCs w:val="18"/>
+              </w:rPr>
+              <w:t>S</w:t>
+            </w:r>
+            <w:r>
+              <w:rPr>
+                <w:sz w:val="18"/>
+                <w:szCs w:val="18"/>
+                <w:lang w:val="vi-VN"/>
+              </w:rPr>
+              <w:t>2</w:t>
             </w:r>
           </w:p>
         </w:tc>
       </w:tr>
       <w:tr>
-        <w:tblPrEx>
-          <w:tblCellMar>
-            <w:top w:w="0" w:type="dxa"/>
-            <w:bottom w:w="0" w:type="dxa"/>
-          </w:tblCellMar>
-        </w:tblPrEx>
         <w:trPr>
           <w:cantSplit/>
         </w:trPr>
@@ -3386,12 +3252,6 @@
         </w:tc>
       </w:tr>
       <w:tr>
-        <w:tblPrEx>
-          <w:tblCellMar>
-            <w:top w:w="0" w:type="dxa"/>
-            <w:bottom w:w="0" w:type="dxa"/>
-          </w:tblCellMar>
-        </w:tblPrEx>
         <w:trPr>
           <w:cantSplit/>
         </w:trPr>
@@ -3469,7 +3329,7 @@
                 <w:sz w:val="18"/>
                 <w:szCs w:val="18"/>
               </w:rPr>
-              <w:t>Write budget and goal calculations with unit tests. Chatbot intent detection.</w:t>
+              <w:t>UI/UX design.</w:t>
             </w:r>
           </w:p>
         </w:tc>
@@ -3575,18 +3435,12 @@
                 <w:sz w:val="18"/>
                 <w:szCs w:val="18"/>
               </w:rPr>
-              <w:t>S3</w:t>
+              <w:t>S1</w:t>
             </w:r>
           </w:p>
         </w:tc>
       </w:tr>
       <w:tr>
-        <w:tblPrEx>
-          <w:tblCellMar>
-            <w:top w:w="0" w:type="dxa"/>
-            <w:bottom w:w="0" w:type="dxa"/>
-          </w:tblCellMar>
-        </w:tblPrEx>
         <w:trPr>
           <w:cantSplit/>
         </w:trPr>
@@ -3777,12 +3631,6 @@
         </w:tc>
       </w:tr>
       <w:tr>
-        <w:tblPrEx>
-          <w:tblCellMar>
-            <w:top w:w="0" w:type="dxa"/>
-            <w:bottom w:w="0" w:type="dxa"/>
-          </w:tblCellMar>
-        </w:tblPrEx>
         <w:trPr>
           <w:cantSplit/>
         </w:trPr>
@@ -3972,12 +3820,6 @@
         </w:tc>
       </w:tr>
       <w:tr>
-        <w:tblPrEx>
-          <w:tblCellMar>
-            <w:top w:w="0" w:type="dxa"/>
-            <w:bottom w:w="0" w:type="dxa"/>
-          </w:tblCellMar>
-        </w:tblPrEx>
         <w:trPr>
           <w:cantSplit/>
         </w:trPr>
@@ -4167,12 +4009,6 @@
         </w:tc>
       </w:tr>
       <w:tr>
-        <w:tblPrEx>
-          <w:tblCellMar>
-            <w:top w:w="0" w:type="dxa"/>
-            <w:bottom w:w="0" w:type="dxa"/>
-          </w:tblCellMar>
-        </w:tblPrEx>
         <w:trPr>
           <w:cantSplit/>
         </w:trPr>
@@ -4362,12 +4198,6 @@
         </w:tc>
       </w:tr>
       <w:tr>
-        <w:tblPrEx>
-          <w:tblCellMar>
-            <w:top w:w="0" w:type="dxa"/>
-            <w:bottom w:w="0" w:type="dxa"/>
-          </w:tblCellMar>
-        </w:tblPrEx>
         <w:trPr>
           <w:cantSplit/>
         </w:trPr>
@@ -4557,12 +4387,6 @@
         </w:tc>
       </w:tr>
       <w:tr>
-        <w:tblPrEx>
-          <w:tblCellMar>
-            <w:top w:w="0" w:type="dxa"/>
-            <w:bottom w:w="0" w:type="dxa"/>
-          </w:tblCellMar>
-        </w:tblPrEx>
         <w:trPr>
           <w:cantSplit/>
         </w:trPr>
@@ -4752,12 +4576,6 @@
         </w:tc>
       </w:tr>
       <w:tr>
-        <w:tblPrEx>
-          <w:tblCellMar>
-            <w:top w:w="0" w:type="dxa"/>
-            <w:bottom w:w="0" w:type="dxa"/>
-          </w:tblCellMar>
-        </w:tblPrEx>
         <w:trPr>
           <w:cantSplit/>
         </w:trPr>
@@ -4947,12 +4765,6 @@
         </w:tc>
       </w:tr>
       <w:tr>
-        <w:tblPrEx>
-          <w:tblCellMar>
-            <w:top w:w="0" w:type="dxa"/>
-            <w:bottom w:w="0" w:type="dxa"/>
-          </w:tblCellMar>
-        </w:tblPrEx>
         <w:trPr>
           <w:cantSplit/>
         </w:trPr>
@@ -5142,12 +4954,6 @@
         </w:tc>
       </w:tr>
       <w:tr>
-        <w:tblPrEx>
-          <w:tblCellMar>
-            <w:top w:w="0" w:type="dxa"/>
-            <w:bottom w:w="0" w:type="dxa"/>
-          </w:tblCellMar>
-        </w:tblPrEx>
         <w:trPr>
           <w:cantSplit/>
         </w:trPr>
@@ -5337,12 +5143,6 @@
         </w:tc>
       </w:tr>
       <w:tr>
-        <w:tblPrEx>
-          <w:tblCellMar>
-            <w:top w:w="0" w:type="dxa"/>
-            <w:bottom w:w="0" w:type="dxa"/>
-          </w:tblCellMar>
-        </w:tblPrEx>
         <w:trPr>
           <w:cantSplit/>
         </w:trPr>
@@ -5532,12 +5332,6 @@
         </w:tc>
       </w:tr>
       <w:tr>
-        <w:tblPrEx>
-          <w:tblCellMar>
-            <w:top w:w="0" w:type="dxa"/>
-            <w:bottom w:w="0" w:type="dxa"/>
-          </w:tblCellMar>
-        </w:tblPrEx>
         <w:trPr>
           <w:cantSplit/>
         </w:trPr>
@@ -5727,12 +5521,6 @@
         </w:tc>
       </w:tr>
       <w:tr>
-        <w:tblPrEx>
-          <w:tblCellMar>
-            <w:top w:w="0" w:type="dxa"/>
-            <w:bottom w:w="0" w:type="dxa"/>
-          </w:tblCellMar>
-        </w:tblPrEx>
         <w:trPr>
           <w:cantSplit/>
         </w:trPr>
@@ -5922,12 +5710,6 @@
         </w:tc>
       </w:tr>
       <w:tr>
-        <w:tblPrEx>
-          <w:tblCellMar>
-            <w:top w:w="0" w:type="dxa"/>
-            <w:bottom w:w="0" w:type="dxa"/>
-          </w:tblCellMar>
-        </w:tblPrEx>
         <w:trPr>
           <w:cantSplit/>
         </w:trPr>
@@ -6117,12 +5899,6 @@
         </w:tc>
       </w:tr>
       <w:tr>
-        <w:tblPrEx>
-          <w:tblCellMar>
-            <w:top w:w="0" w:type="dxa"/>
-            <w:bottom w:w="0" w:type="dxa"/>
-          </w:tblCellMar>
-        </w:tblPrEx>
         <w:trPr>
           <w:cantSplit/>
         </w:trPr>
@@ -6312,12 +6088,6 @@
         </w:tc>
       </w:tr>
       <w:tr>
-        <w:tblPrEx>
-          <w:tblCellMar>
-            <w:top w:w="0" w:type="dxa"/>
-            <w:bottom w:w="0" w:type="dxa"/>
-          </w:tblCellMar>
-        </w:tblPrEx>
         <w:trPr>
           <w:cantSplit/>
         </w:trPr>
@@ -6508,12 +6278,6 @@
         </w:tc>
       </w:tr>
       <w:tr>
-        <w:tblPrEx>
-          <w:tblCellMar>
-            <w:top w:w="0" w:type="dxa"/>
-            <w:bottom w:w="0" w:type="dxa"/>
-          </w:tblCellMar>
-        </w:tblPrEx>
         <w:trPr>
           <w:cantSplit/>
         </w:trPr>
@@ -6703,12 +6467,6 @@
         </w:tc>
       </w:tr>
       <w:tr>
-        <w:tblPrEx>
-          <w:tblCellMar>
-            <w:top w:w="0" w:type="dxa"/>
-            <w:bottom w:w="0" w:type="dxa"/>
-          </w:tblCellMar>
-        </w:tblPrEx>
         <w:trPr>
           <w:cantSplit/>
         </w:trPr>
@@ -6898,12 +6656,6 @@
         </w:tc>
       </w:tr>
       <w:tr>
-        <w:tblPrEx>
-          <w:tblCellMar>
-            <w:top w:w="0" w:type="dxa"/>
-            <w:bottom w:w="0" w:type="dxa"/>
-          </w:tblCellMar>
-        </w:tblPrEx>
         <w:trPr>
           <w:cantSplit/>
         </w:trPr>
@@ -7093,12 +6845,6 @@
         </w:tc>
       </w:tr>
       <w:tr>
-        <w:tblPrEx>
-          <w:tblCellMar>
-            <w:top w:w="0" w:type="dxa"/>
-            <w:bottom w:w="0" w:type="dxa"/>
-          </w:tblCellMar>
-        </w:tblPrEx>
         <w:trPr>
           <w:cantSplit/>
         </w:trPr>
@@ -7288,12 +7034,6 @@
         </w:tc>
       </w:tr>
       <w:tr>
-        <w:tblPrEx>
-          <w:tblCellMar>
-            <w:top w:w="0" w:type="dxa"/>
-            <w:bottom w:w="0" w:type="dxa"/>
-          </w:tblCellMar>
-        </w:tblPrEx>
         <w:trPr>
           <w:cantSplit/>
         </w:trPr>
@@ -7483,12 +7223,6 @@
         </w:tc>
       </w:tr>
       <w:tr>
-        <w:tblPrEx>
-          <w:tblCellMar>
-            <w:top w:w="0" w:type="dxa"/>
-            <w:bottom w:w="0" w:type="dxa"/>
-          </w:tblCellMar>
-        </w:tblPrEx>
         <w:trPr>
           <w:cantSplit/>
         </w:trPr>
@@ -7678,12 +7412,6 @@
         </w:tc>
       </w:tr>
       <w:tr>
-        <w:tblPrEx>
-          <w:tblCellMar>
-            <w:top w:w="0" w:type="dxa"/>
-            <w:bottom w:w="0" w:type="dxa"/>
-          </w:tblCellMar>
-        </w:tblPrEx>
         <w:trPr>
           <w:cantSplit/>
         </w:trPr>
@@ -7873,12 +7601,6 @@
         </w:tc>
       </w:tr>
       <w:tr>
-        <w:tblPrEx>
-          <w:tblCellMar>
-            <w:top w:w="0" w:type="dxa"/>
-            <w:bottom w:w="0" w:type="dxa"/>
-          </w:tblCellMar>
-        </w:tblPrEx>
         <w:trPr>
           <w:cantSplit/>
         </w:trPr>
@@ -8068,12 +7790,6 @@
         </w:tc>
       </w:tr>
       <w:tr>
-        <w:tblPrEx>
-          <w:tblCellMar>
-            <w:top w:w="0" w:type="dxa"/>
-            <w:bottom w:w="0" w:type="dxa"/>
-          </w:tblCellMar>
-        </w:tblPrEx>
         <w:trPr>
           <w:cantSplit/>
         </w:trPr>
@@ -8263,12 +7979,6 @@
         </w:tc>
       </w:tr>
       <w:tr>
-        <w:tblPrEx>
-          <w:tblCellMar>
-            <w:top w:w="0" w:type="dxa"/>
-            <w:bottom w:w="0" w:type="dxa"/>
-          </w:tblCellMar>
-        </w:tblPrEx>
         <w:trPr>
           <w:cantSplit/>
         </w:trPr>
@@ -8458,12 +8168,6 @@
         </w:tc>
       </w:tr>
       <w:tr>
-        <w:tblPrEx>
-          <w:tblCellMar>
-            <w:top w:w="0" w:type="dxa"/>
-            <w:bottom w:w="0" w:type="dxa"/>
-          </w:tblCellMar>
-        </w:tblPrEx>
         <w:trPr>
           <w:cantSplit/>
         </w:trPr>
@@ -8653,12 +8357,6 @@
         </w:tc>
       </w:tr>
       <w:tr>
-        <w:tblPrEx>
-          <w:tblCellMar>
-            <w:top w:w="0" w:type="dxa"/>
-            <w:bottom w:w="0" w:type="dxa"/>
-          </w:tblCellMar>
-        </w:tblPrEx>
         <w:trPr>
           <w:cantSplit/>
         </w:trPr>
@@ -8886,7 +8584,7 @@
         <w:spacing w:after="120"/>
       </w:pPr>
       <w:r>
-        <w:t xml:space="preserve">Hai app dùng chung Firebase Realtime Database. Tên node / field lấy đúng theo database.md. </w:t>
+        <w:t xml:space="preserve">Hai app dùng chung Firestore. Tên field lấy đúng theo database.md. </w:t>
       </w:r>
       <w:r>
         <w:rPr>
@@ -8920,12 +8618,6 @@
         <w:gridCol w:w="1669"/>
       </w:tblGrid>
       <w:tr>
-        <w:tblPrEx>
-          <w:tblCellMar>
-            <w:top w:w="0" w:type="dxa"/>
-            <w:bottom w:w="0" w:type="dxa"/>
-          </w:tblCellMar>
-        </w:tblPrEx>
         <w:trPr>
           <w:tblHeader/>
         </w:trPr>
@@ -9051,12 +8743,6 @@
         </w:tc>
       </w:tr>
       <w:tr>
-        <w:tblPrEx>
-          <w:tblCellMar>
-            <w:top w:w="0" w:type="dxa"/>
-            <w:bottom w:w="0" w:type="dxa"/>
-          </w:tblCellMar>
-        </w:tblPrEx>
         <w:tc>
           <w:tcPr>
             <w:tcW w:w="2038" w:type="dxa"/>
@@ -9163,12 +8849,6 @@
         </w:tc>
       </w:tr>
       <w:tr>
-        <w:tblPrEx>
-          <w:tblCellMar>
-            <w:top w:w="0" w:type="dxa"/>
-            <w:bottom w:w="0" w:type="dxa"/>
-          </w:tblCellMar>
-        </w:tblPrEx>
         <w:tc>
           <w:tcPr>
             <w:tcW w:w="2038" w:type="dxa"/>
@@ -9275,12 +8955,6 @@
         </w:tc>
       </w:tr>
       <w:tr>
-        <w:tblPrEx>
-          <w:tblCellMar>
-            <w:top w:w="0" w:type="dxa"/>
-            <w:bottom w:w="0" w:type="dxa"/>
-          </w:tblCellMar>
-        </w:tblPrEx>
         <w:tc>
           <w:tcPr>
             <w:tcW w:w="2038" w:type="dxa"/>
@@ -9387,12 +9061,6 @@
         </w:tc>
       </w:tr>
       <w:tr>
-        <w:tblPrEx>
-          <w:tblCellMar>
-            <w:top w:w="0" w:type="dxa"/>
-            <w:bottom w:w="0" w:type="dxa"/>
-          </w:tblCellMar>
-        </w:tblPrEx>
         <w:tc>
           <w:tcPr>
             <w:tcW w:w="2038" w:type="dxa"/>
@@ -9499,12 +9167,6 @@
         </w:tc>
       </w:tr>
       <w:tr>
-        <w:tblPrEx>
-          <w:tblCellMar>
-            <w:top w:w="0" w:type="dxa"/>
-            <w:bottom w:w="0" w:type="dxa"/>
-          </w:tblCellMar>
-        </w:tblPrEx>
         <w:tc>
           <w:tcPr>
             <w:tcW w:w="2038" w:type="dxa"/>
@@ -9611,12 +9273,6 @@
         </w:tc>
       </w:tr>
       <w:tr>
-        <w:tblPrEx>
-          <w:tblCellMar>
-            <w:top w:w="0" w:type="dxa"/>
-            <w:bottom w:w="0" w:type="dxa"/>
-          </w:tblCellMar>
-        </w:tblPrEx>
         <w:tc>
           <w:tcPr>
             <w:tcW w:w="2038" w:type="dxa"/>
@@ -9691,7 +9347,7 @@
                 <w:sz w:val="20"/>
                 <w:szCs w:val="20"/>
               </w:rPr>
-              <w:t>A1 Overview + User Detail, A2 Analytics — đọc 1 lần rồi đếm / cộng ở app (RTDB không có aggregate)</w:t>
+              <w:t>A1 Overview + User Detail, A2 Analytics — chỉ aggregate query</w:t>
             </w:r>
           </w:p>
         </w:tc>
@@ -9793,7 +9449,7 @@
         <w:t>model Transaction</w:t>
       </w:r>
       <w:r>
-        <w:t xml:space="preserve"> của S1, ghi chung 1 multi-path update() (D-05).</w:t>
+        <w:t xml:space="preserve"> của S1, ghi chung WriteBatch (D-05).</w:t>
       </w:r>
     </w:p>
     <w:p>
@@ -9886,12 +9542,6 @@
         <w:gridCol w:w="7711"/>
       </w:tblGrid>
       <w:tr>
-        <w:tblPrEx>
-          <w:tblCellMar>
-            <w:top w:w="0" w:type="dxa"/>
-            <w:bottom w:w="0" w:type="dxa"/>
-          </w:tblCellMar>
-        </w:tblPrEx>
         <w:trPr>
           <w:tblHeader/>
         </w:trPr>
@@ -9957,12 +9607,6 @@
         </w:tc>
       </w:tr>
       <w:tr>
-        <w:tblPrEx>
-          <w:tblCellMar>
-            <w:top w:w="0" w:type="dxa"/>
-            <w:bottom w:w="0" w:type="dxa"/>
-          </w:tblCellMar>
-        </w:tblPrEx>
         <w:tc>
           <w:tcPr>
             <w:tcW w:w="1927" w:type="dxa"/>
@@ -10017,12 +9661,6 @@
         </w:tc>
       </w:tr>
       <w:tr>
-        <w:tblPrEx>
-          <w:tblCellMar>
-            <w:top w:w="0" w:type="dxa"/>
-            <w:bottom w:w="0" w:type="dxa"/>
-          </w:tblCellMar>
-        </w:tblPrEx>
         <w:tc>
           <w:tcPr>
             <w:tcW w:w="1927" w:type="dxa"/>
@@ -10109,12 +9747,6 @@
         </w:tc>
       </w:tr>
       <w:tr>
-        <w:tblPrEx>
-          <w:tblCellMar>
-            <w:top w:w="0" w:type="dxa"/>
-            <w:bottom w:w="0" w:type="dxa"/>
-          </w:tblCellMar>
-        </w:tblPrEx>
         <w:tc>
           <w:tcPr>
             <w:tcW w:w="1927" w:type="dxa"/>
@@ -10169,12 +9801,6 @@
         </w:tc>
       </w:tr>
       <w:tr>
-        <w:tblPrEx>
-          <w:tblCellMar>
-            <w:top w:w="0" w:type="dxa"/>
-            <w:bottom w:w="0" w:type="dxa"/>
-          </w:tblCellMar>
-        </w:tblPrEx>
         <w:tc>
           <w:tcPr>
             <w:tcW w:w="1927" w:type="dxa"/>
@@ -10229,12 +9855,6 @@
         </w:tc>
       </w:tr>
       <w:tr>
-        <w:tblPrEx>
-          <w:tblCellMar>
-            <w:top w:w="0" w:type="dxa"/>
-            <w:bottom w:w="0" w:type="dxa"/>
-          </w:tblCellMar>
-        </w:tblPrEx>
         <w:tc>
           <w:tcPr>
             <w:tcW w:w="1927" w:type="dxa"/>
@@ -10289,12 +9909,6 @@
         </w:tc>
       </w:tr>
       <w:tr>
-        <w:tblPrEx>
-          <w:tblCellMar>
-            <w:top w:w="0" w:type="dxa"/>
-            <w:bottom w:w="0" w:type="dxa"/>
-          </w:tblCellMar>
-        </w:tblPrEx>
         <w:tc>
           <w:tcPr>
             <w:tcW w:w="1927" w:type="dxa"/>

</xml_diff>